<commit_message>
added azure-pipeline new changes
</commit_message>
<xml_diff>
--- a/Azure-DevOps-Pipeline/Azure DevOps Pipeline.docx
+++ b/Azure-DevOps-Pipeline/Azure DevOps Pipeline.docx
@@ -115,7 +115,6 @@
           <w14:ligatures w14:val="none"/>
         </w:rPr>
       </w:pPr>
-      <w:proofErr w:type="spellStart"/>
       <w:r>
         <w:rPr>
           <w:rFonts w:ascii="Times New Roman" w:eastAsia="Times New Roman" w:hAnsi="Times New Roman" w:cs="Times New Roman"/>
@@ -125,43 +124,7 @@
           <w:lang w:eastAsia="en-IN"/>
           <w14:ligatures w14:val="none"/>
         </w:rPr>
-        <w:t>az</w:t>
-      </w:r>
-      <w:proofErr w:type="spellEnd"/>
-      <w:r>
-        <w:rPr>
-          <w:rFonts w:ascii="Times New Roman" w:eastAsia="Times New Roman" w:hAnsi="Times New Roman" w:cs="Times New Roman"/>
-          <w:kern w:val="0"/>
-          <w:sz w:val="28"/>
-          <w:szCs w:val="28"/>
-          <w:lang w:eastAsia="en-IN"/>
-          <w14:ligatures w14:val="none"/>
-        </w:rPr>
-        <w:t xml:space="preserve"> </w:t>
-      </w:r>
-      <w:proofErr w:type="spellStart"/>
-      <w:r>
-        <w:rPr>
-          <w:rFonts w:ascii="Times New Roman" w:eastAsia="Times New Roman" w:hAnsi="Times New Roman" w:cs="Times New Roman"/>
-          <w:kern w:val="0"/>
-          <w:sz w:val="28"/>
-          <w:szCs w:val="28"/>
-          <w:lang w:eastAsia="en-IN"/>
-          <w14:ligatures w14:val="none"/>
-        </w:rPr>
-        <w:t>acr</w:t>
-      </w:r>
-      <w:proofErr w:type="spellEnd"/>
-      <w:r>
-        <w:rPr>
-          <w:rFonts w:ascii="Times New Roman" w:eastAsia="Times New Roman" w:hAnsi="Times New Roman" w:cs="Times New Roman"/>
-          <w:kern w:val="0"/>
-          <w:sz w:val="28"/>
-          <w:szCs w:val="28"/>
-          <w:lang w:eastAsia="en-IN"/>
-          <w14:ligatures w14:val="none"/>
-        </w:rPr>
-        <w:t xml:space="preserve"> create \</w:t>
+        <w:t>az acr create \</w:t>
       </w:r>
     </w:p>
     <w:p>
@@ -287,31 +250,7 @@
           <w:lang w:eastAsia="en-IN"/>
           <w14:ligatures w14:val="none"/>
         </w:rPr>
-        <w:t xml:space="preserve">  --</w:t>
-      </w:r>
-      <w:proofErr w:type="spellStart"/>
-      <w:r>
-        <w:rPr>
-          <w:rFonts w:ascii="Times New Roman" w:eastAsia="Times New Roman" w:hAnsi="Times New Roman" w:cs="Times New Roman"/>
-          <w:kern w:val="0"/>
-          <w:sz w:val="28"/>
-          <w:szCs w:val="28"/>
-          <w:lang w:eastAsia="en-IN"/>
-          <w14:ligatures w14:val="none"/>
-        </w:rPr>
-        <w:t>sku</w:t>
-      </w:r>
-      <w:proofErr w:type="spellEnd"/>
-      <w:r>
-        <w:rPr>
-          <w:rFonts w:ascii="Times New Roman" w:eastAsia="Times New Roman" w:hAnsi="Times New Roman" w:cs="Times New Roman"/>
-          <w:kern w:val="0"/>
-          <w:sz w:val="28"/>
-          <w:szCs w:val="28"/>
-          <w:lang w:eastAsia="en-IN"/>
-          <w14:ligatures w14:val="none"/>
-        </w:rPr>
-        <w:t xml:space="preserve"> Basic</w:t>
+        <w:t xml:space="preserve">  --sku Basic</w:t>
       </w:r>
     </w:p>
     <w:p>
@@ -483,7 +422,6 @@
           <w14:ligatures w14:val="none"/>
         </w:rPr>
       </w:pPr>
-      <w:proofErr w:type="spellStart"/>
       <w:r>
         <w:rPr>
           <w:rFonts w:ascii="Times New Roman" w:eastAsia="Times New Roman" w:hAnsi="Times New Roman" w:cs="Times New Roman"/>
@@ -493,43 +431,7 @@
           <w:lang w:eastAsia="en-IN"/>
           <w14:ligatures w14:val="none"/>
         </w:rPr>
-        <w:t>az</w:t>
-      </w:r>
-      <w:proofErr w:type="spellEnd"/>
-      <w:r>
-        <w:rPr>
-          <w:rFonts w:ascii="Times New Roman" w:eastAsia="Times New Roman" w:hAnsi="Times New Roman" w:cs="Times New Roman"/>
-          <w:kern w:val="0"/>
-          <w:sz w:val="28"/>
-          <w:szCs w:val="28"/>
-          <w:lang w:eastAsia="en-IN"/>
-          <w14:ligatures w14:val="none"/>
-        </w:rPr>
-        <w:t xml:space="preserve"> </w:t>
-      </w:r>
-      <w:proofErr w:type="spellStart"/>
-      <w:r>
-        <w:rPr>
-          <w:rFonts w:ascii="Times New Roman" w:eastAsia="Times New Roman" w:hAnsi="Times New Roman" w:cs="Times New Roman"/>
-          <w:kern w:val="0"/>
-          <w:sz w:val="28"/>
-          <w:szCs w:val="28"/>
-          <w:lang w:eastAsia="en-IN"/>
-          <w14:ligatures w14:val="none"/>
-        </w:rPr>
-        <w:t>acr</w:t>
-      </w:r>
-      <w:proofErr w:type="spellEnd"/>
-      <w:r>
-        <w:rPr>
-          <w:rFonts w:ascii="Times New Roman" w:eastAsia="Times New Roman" w:hAnsi="Times New Roman" w:cs="Times New Roman"/>
-          <w:kern w:val="0"/>
-          <w:sz w:val="28"/>
-          <w:szCs w:val="28"/>
-          <w:lang w:eastAsia="en-IN"/>
-          <w14:ligatures w14:val="none"/>
-        </w:rPr>
-        <w:t xml:space="preserve"> list –output table</w:t>
+        <w:t>az acr list –output table</w:t>
       </w:r>
     </w:p>
     <w:p>
@@ -778,7 +680,6 @@
           <w14:ligatures w14:val="none"/>
         </w:rPr>
       </w:pPr>
-      <w:proofErr w:type="spellStart"/>
       <w:r>
         <w:rPr>
           <w:rFonts w:ascii="Courier New" w:eastAsia="Times New Roman" w:hAnsi="Courier New" w:cs="Courier New"/>
@@ -788,43 +689,7 @@
           <w:lang w:eastAsia="en-IN"/>
           <w14:ligatures w14:val="none"/>
         </w:rPr>
-        <w:t>az</w:t>
-      </w:r>
-      <w:proofErr w:type="spellEnd"/>
-      <w:r>
-        <w:rPr>
-          <w:rFonts w:ascii="Courier New" w:eastAsia="Times New Roman" w:hAnsi="Courier New" w:cs="Courier New"/>
-          <w:kern w:val="0"/>
-          <w:sz w:val="20"/>
-          <w:szCs w:val="20"/>
-          <w:lang w:eastAsia="en-IN"/>
-          <w14:ligatures w14:val="none"/>
-        </w:rPr>
-        <w:t xml:space="preserve"> </w:t>
-      </w:r>
-      <w:proofErr w:type="spellStart"/>
-      <w:r>
-        <w:rPr>
-          <w:rFonts w:ascii="Courier New" w:eastAsia="Times New Roman" w:hAnsi="Courier New" w:cs="Courier New"/>
-          <w:kern w:val="0"/>
-          <w:sz w:val="20"/>
-          <w:szCs w:val="20"/>
-          <w:lang w:eastAsia="en-IN"/>
-          <w14:ligatures w14:val="none"/>
-        </w:rPr>
-        <w:t>aks</w:t>
-      </w:r>
-      <w:proofErr w:type="spellEnd"/>
-      <w:r>
-        <w:rPr>
-          <w:rFonts w:ascii="Courier New" w:eastAsia="Times New Roman" w:hAnsi="Courier New" w:cs="Courier New"/>
-          <w:kern w:val="0"/>
-          <w:sz w:val="20"/>
-          <w:szCs w:val="20"/>
-          <w:lang w:eastAsia="en-IN"/>
-          <w14:ligatures w14:val="none"/>
-        </w:rPr>
-        <w:t xml:space="preserve"> update \</w:t>
+        <w:t>az aks update \</w:t>
       </w:r>
     </w:p>
     <w:p>
@@ -950,31 +815,7 @@
           <w:lang w:eastAsia="en-IN"/>
           <w14:ligatures w14:val="none"/>
         </w:rPr>
-        <w:t xml:space="preserve">  --attach-</w:t>
-      </w:r>
-      <w:proofErr w:type="spellStart"/>
-      <w:r>
-        <w:rPr>
-          <w:rFonts w:ascii="Courier New" w:eastAsia="Times New Roman" w:hAnsi="Courier New" w:cs="Courier New"/>
-          <w:kern w:val="0"/>
-          <w:sz w:val="20"/>
-          <w:szCs w:val="20"/>
-          <w:lang w:eastAsia="en-IN"/>
-          <w14:ligatures w14:val="none"/>
-        </w:rPr>
-        <w:t>acr</w:t>
-      </w:r>
-      <w:proofErr w:type="spellEnd"/>
-      <w:r>
-        <w:rPr>
-          <w:rFonts w:ascii="Courier New" w:eastAsia="Times New Roman" w:hAnsi="Courier New" w:cs="Courier New"/>
-          <w:kern w:val="0"/>
-          <w:sz w:val="20"/>
-          <w:szCs w:val="20"/>
-          <w:lang w:eastAsia="en-IN"/>
-          <w14:ligatures w14:val="none"/>
-        </w:rPr>
-        <w:t xml:space="preserve"> &lt;ACR_NAME&gt;</w:t>
+        <w:t xml:space="preserve">  --attach-acr &lt;ACR_NAME&gt;</w:t>
       </w:r>
     </w:p>
     <w:p>
@@ -1099,31 +940,7 @@
           <w14:ligatures w14:val="none"/>
         </w:rPr>
         <w:lastRenderedPageBreak/>
-        <w:t>Create a file called azure-</w:t>
-      </w:r>
-      <w:proofErr w:type="spellStart"/>
-      <w:r>
-        <w:rPr>
-          <w:rFonts w:ascii="Times New Roman" w:eastAsia="Times New Roman" w:hAnsi="Times New Roman" w:cs="Times New Roman"/>
-          <w:kern w:val="0"/>
-          <w:sz w:val="28"/>
-          <w:szCs w:val="28"/>
-          <w:lang w:eastAsia="en-IN"/>
-          <w14:ligatures w14:val="none"/>
-        </w:rPr>
-        <w:t>devops.yaml</w:t>
-      </w:r>
-      <w:proofErr w:type="spellEnd"/>
-      <w:r>
-        <w:rPr>
-          <w:rFonts w:ascii="Times New Roman" w:eastAsia="Times New Roman" w:hAnsi="Times New Roman" w:cs="Times New Roman"/>
-          <w:kern w:val="0"/>
-          <w:sz w:val="28"/>
-          <w:szCs w:val="28"/>
-          <w:lang w:eastAsia="en-IN"/>
-          <w14:ligatures w14:val="none"/>
-        </w:rPr>
-        <w:t xml:space="preserve"> file and paste below script </w:t>
+        <w:t xml:space="preserve">Create a file called azure-devops.yaml file and paste below script </w:t>
       </w:r>
       <w:r>
         <w:rPr>
@@ -1168,26 +985,14 @@
       <w:r>
         <w:rPr>
           <w:rFonts w:ascii="Consolas" w:eastAsia="Times New Roman" w:hAnsi="Consolas" w:cs="Times New Roman"/>
-          <w:color w:val="800000"/>
-          <w:kern w:val="0"/>
-          <w:sz w:val="21"/>
-          <w:szCs w:val="21"/>
-          <w:lang w:eastAsia="en-IN"/>
-          <w14:ligatures w14:val="none"/>
-        </w:rPr>
-        <w:t>trigger</w:t>
-      </w:r>
-      <w:r>
-        <w:rPr>
-          <w:rFonts w:ascii="Consolas" w:eastAsia="Times New Roman" w:hAnsi="Consolas" w:cs="Times New Roman"/>
-          <w:color w:val="3B3B3B"/>
-          <w:kern w:val="0"/>
-          <w:sz w:val="21"/>
-          <w:szCs w:val="21"/>
-          <w:lang w:eastAsia="en-IN"/>
-          <w14:ligatures w14:val="none"/>
-        </w:rPr>
-        <w:t>:</w:t>
+          <w:color w:val="3B3B3B"/>
+          <w:kern w:val="0"/>
+          <w:sz w:val="21"/>
+          <w:szCs w:val="21"/>
+          <w:lang w:eastAsia="en-IN"/>
+          <w14:ligatures w14:val="none"/>
+        </w:rPr>
+        <w:t>trigger:</w:t>
       </w:r>
     </w:p>
     <w:p>
@@ -1214,45 +1019,7 @@
           <w:lang w:eastAsia="en-IN"/>
           <w14:ligatures w14:val="none"/>
         </w:rPr>
-        <w:t xml:space="preserve">- </w:t>
-      </w:r>
-      <w:r>
-        <w:rPr>
-          <w:rFonts w:ascii="Consolas" w:eastAsia="Times New Roman" w:hAnsi="Consolas" w:cs="Times New Roman"/>
-          <w:color w:val="0000FF"/>
-          <w:kern w:val="0"/>
-          <w:sz w:val="21"/>
-          <w:szCs w:val="21"/>
-          <w:lang w:eastAsia="en-IN"/>
-          <w14:ligatures w14:val="none"/>
-        </w:rPr>
-        <w:t>azure-</w:t>
-      </w:r>
-      <w:proofErr w:type="spellStart"/>
-      <w:r>
-        <w:rPr>
-          <w:rFonts w:ascii="Consolas" w:eastAsia="Times New Roman" w:hAnsi="Consolas" w:cs="Times New Roman"/>
-          <w:color w:val="0000FF"/>
-          <w:kern w:val="0"/>
-          <w:sz w:val="21"/>
-          <w:szCs w:val="21"/>
-          <w:lang w:eastAsia="en-IN"/>
-          <w14:ligatures w14:val="none"/>
-        </w:rPr>
-        <w:t>argo</w:t>
-      </w:r>
-      <w:proofErr w:type="spellEnd"/>
-      <w:r>
-        <w:rPr>
-          <w:rFonts w:ascii="Consolas" w:eastAsia="Times New Roman" w:hAnsi="Consolas" w:cs="Times New Roman"/>
-          <w:color w:val="0000FF"/>
-          <w:kern w:val="0"/>
-          <w:sz w:val="21"/>
-          <w:szCs w:val="21"/>
-          <w:lang w:eastAsia="en-IN"/>
-          <w14:ligatures w14:val="none"/>
-        </w:rPr>
-        <w:t>-GA</w:t>
+        <w:t>- azure-devops</w:t>
       </w:r>
     </w:p>
     <w:p>
@@ -1287,26 +1054,14 @@
       <w:r>
         <w:rPr>
           <w:rFonts w:ascii="Consolas" w:eastAsia="Times New Roman" w:hAnsi="Consolas" w:cs="Times New Roman"/>
-          <w:color w:val="800000"/>
-          <w:kern w:val="0"/>
-          <w:sz w:val="21"/>
-          <w:szCs w:val="21"/>
-          <w:lang w:eastAsia="en-IN"/>
-          <w14:ligatures w14:val="none"/>
-        </w:rPr>
-        <w:t>variables</w:t>
-      </w:r>
-      <w:r>
-        <w:rPr>
-          <w:rFonts w:ascii="Consolas" w:eastAsia="Times New Roman" w:hAnsi="Consolas" w:cs="Times New Roman"/>
-          <w:color w:val="3B3B3B"/>
-          <w:kern w:val="0"/>
-          <w:sz w:val="21"/>
-          <w:szCs w:val="21"/>
-          <w:lang w:eastAsia="en-IN"/>
-          <w14:ligatures w14:val="none"/>
-        </w:rPr>
-        <w:t>:</w:t>
+          <w:color w:val="3B3B3B"/>
+          <w:kern w:val="0"/>
+          <w:sz w:val="21"/>
+          <w:szCs w:val="21"/>
+          <w:lang w:eastAsia="en-IN"/>
+          <w14:ligatures w14:val="none"/>
+        </w:rPr>
+        <w:t>variables:</w:t>
       </w:r>
     </w:p>
     <w:p>
@@ -1333,45 +1088,7 @@
           <w:lang w:eastAsia="en-IN"/>
           <w14:ligatures w14:val="none"/>
         </w:rPr>
-        <w:t xml:space="preserve">  </w:t>
-      </w:r>
-      <w:proofErr w:type="spellStart"/>
-      <w:r>
-        <w:rPr>
-          <w:rFonts w:ascii="Consolas" w:eastAsia="Times New Roman" w:hAnsi="Consolas" w:cs="Times New Roman"/>
-          <w:color w:val="800000"/>
-          <w:kern w:val="0"/>
-          <w:sz w:val="21"/>
-          <w:szCs w:val="21"/>
-          <w:lang w:eastAsia="en-IN"/>
-          <w14:ligatures w14:val="none"/>
-        </w:rPr>
-        <w:t>imageName</w:t>
-      </w:r>
-      <w:proofErr w:type="spellEnd"/>
-      <w:r>
-        <w:rPr>
-          <w:rFonts w:ascii="Consolas" w:eastAsia="Times New Roman" w:hAnsi="Consolas" w:cs="Times New Roman"/>
-          <w:color w:val="3B3B3B"/>
-          <w:kern w:val="0"/>
-          <w:sz w:val="21"/>
-          <w:szCs w:val="21"/>
-          <w:lang w:eastAsia="en-IN"/>
-          <w14:ligatures w14:val="none"/>
-        </w:rPr>
-        <w:t xml:space="preserve">: </w:t>
-      </w:r>
-      <w:r>
-        <w:rPr>
-          <w:rFonts w:ascii="Consolas" w:eastAsia="Times New Roman" w:hAnsi="Consolas" w:cs="Times New Roman"/>
-          <w:color w:val="0000FF"/>
-          <w:kern w:val="0"/>
-          <w:sz w:val="21"/>
-          <w:szCs w:val="21"/>
-          <w:lang w:eastAsia="en-IN"/>
-          <w14:ligatures w14:val="none"/>
-        </w:rPr>
-        <w:t>fitness-app</w:t>
+        <w:t xml:space="preserve">  imageName: fitness-app</w:t>
       </w:r>
     </w:p>
     <w:p>
@@ -1398,45 +1115,7 @@
           <w:lang w:eastAsia="en-IN"/>
           <w14:ligatures w14:val="none"/>
         </w:rPr>
-        <w:t xml:space="preserve">  </w:t>
-      </w:r>
-      <w:proofErr w:type="spellStart"/>
-      <w:r>
-        <w:rPr>
-          <w:rFonts w:ascii="Consolas" w:eastAsia="Times New Roman" w:hAnsi="Consolas" w:cs="Times New Roman"/>
-          <w:color w:val="800000"/>
-          <w:kern w:val="0"/>
-          <w:sz w:val="21"/>
-          <w:szCs w:val="21"/>
-          <w:lang w:eastAsia="en-IN"/>
-          <w14:ligatures w14:val="none"/>
-        </w:rPr>
-        <w:t>acrLoginServer</w:t>
-      </w:r>
-      <w:proofErr w:type="spellEnd"/>
-      <w:r>
-        <w:rPr>
-          <w:rFonts w:ascii="Consolas" w:eastAsia="Times New Roman" w:hAnsi="Consolas" w:cs="Times New Roman"/>
-          <w:color w:val="3B3B3B"/>
-          <w:kern w:val="0"/>
-          <w:sz w:val="21"/>
-          <w:szCs w:val="21"/>
-          <w:lang w:eastAsia="en-IN"/>
-          <w14:ligatures w14:val="none"/>
-        </w:rPr>
-        <w:t xml:space="preserve">: </w:t>
-      </w:r>
-      <w:r>
-        <w:rPr>
-          <w:rFonts w:ascii="Consolas" w:eastAsia="Times New Roman" w:hAnsi="Consolas" w:cs="Times New Roman"/>
-          <w:color w:val="0000FF"/>
-          <w:kern w:val="0"/>
-          <w:sz w:val="21"/>
-          <w:szCs w:val="21"/>
-          <w:lang w:eastAsia="en-IN"/>
-          <w14:ligatures w14:val="none"/>
-        </w:rPr>
-        <w:t>fitnessacr123.azurecr.io</w:t>
+        <w:t xml:space="preserve">  acrLoginServer: clahandevops123.azurecr.io</w:t>
       </w:r>
     </w:p>
     <w:p>
@@ -1463,69 +1142,7 @@
           <w:lang w:eastAsia="en-IN"/>
           <w14:ligatures w14:val="none"/>
         </w:rPr>
-        <w:t xml:space="preserve">  </w:t>
-      </w:r>
-      <w:r>
-        <w:rPr>
-          <w:rFonts w:ascii="Consolas" w:eastAsia="Times New Roman" w:hAnsi="Consolas" w:cs="Times New Roman"/>
-          <w:color w:val="800000"/>
-          <w:kern w:val="0"/>
-          <w:sz w:val="21"/>
-          <w:szCs w:val="21"/>
-          <w:lang w:eastAsia="en-IN"/>
-          <w14:ligatures w14:val="none"/>
-        </w:rPr>
-        <w:t>tag</w:t>
-      </w:r>
-      <w:r>
-        <w:rPr>
-          <w:rFonts w:ascii="Consolas" w:eastAsia="Times New Roman" w:hAnsi="Consolas" w:cs="Times New Roman"/>
-          <w:color w:val="3B3B3B"/>
-          <w:kern w:val="0"/>
-          <w:sz w:val="21"/>
-          <w:szCs w:val="21"/>
-          <w:lang w:eastAsia="en-IN"/>
-          <w14:ligatures w14:val="none"/>
-        </w:rPr>
-        <w:t xml:space="preserve">: </w:t>
-      </w:r>
-      <w:r>
-        <w:rPr>
-          <w:rFonts w:ascii="Consolas" w:eastAsia="Times New Roman" w:hAnsi="Consolas" w:cs="Times New Roman"/>
-          <w:color w:val="0000FF"/>
-          <w:kern w:val="0"/>
-          <w:sz w:val="21"/>
-          <w:szCs w:val="21"/>
-          <w:lang w:eastAsia="en-IN"/>
-          <w14:ligatures w14:val="none"/>
-        </w:rPr>
-        <w:t>$(</w:t>
-      </w:r>
-      <w:proofErr w:type="spellStart"/>
-      <w:r>
-        <w:rPr>
-          <w:rFonts w:ascii="Consolas" w:eastAsia="Times New Roman" w:hAnsi="Consolas" w:cs="Times New Roman"/>
-          <w:color w:val="0000FF"/>
-          <w:kern w:val="0"/>
-          <w:sz w:val="21"/>
-          <w:szCs w:val="21"/>
-          <w:lang w:eastAsia="en-IN"/>
-          <w14:ligatures w14:val="none"/>
-        </w:rPr>
-        <w:t>Build.BuildId</w:t>
-      </w:r>
-      <w:proofErr w:type="spellEnd"/>
-      <w:r>
-        <w:rPr>
-          <w:rFonts w:ascii="Consolas" w:eastAsia="Times New Roman" w:hAnsi="Consolas" w:cs="Times New Roman"/>
-          <w:color w:val="0000FF"/>
-          <w:kern w:val="0"/>
-          <w:sz w:val="21"/>
-          <w:szCs w:val="21"/>
-          <w:lang w:eastAsia="en-IN"/>
-          <w14:ligatures w14:val="none"/>
-        </w:rPr>
-        <w:t>)</w:t>
+        <w:t xml:space="preserve">  tag: $(Build.BuildId)</w:t>
       </w:r>
     </w:p>
     <w:p>
@@ -1560,26 +1177,14 @@
       <w:r>
         <w:rPr>
           <w:rFonts w:ascii="Consolas" w:eastAsia="Times New Roman" w:hAnsi="Consolas" w:cs="Times New Roman"/>
-          <w:color w:val="800000"/>
-          <w:kern w:val="0"/>
-          <w:sz w:val="21"/>
-          <w:szCs w:val="21"/>
-          <w:lang w:eastAsia="en-IN"/>
-          <w14:ligatures w14:val="none"/>
-        </w:rPr>
-        <w:t>pool</w:t>
-      </w:r>
-      <w:r>
-        <w:rPr>
-          <w:rFonts w:ascii="Consolas" w:eastAsia="Times New Roman" w:hAnsi="Consolas" w:cs="Times New Roman"/>
-          <w:color w:val="3B3B3B"/>
-          <w:kern w:val="0"/>
-          <w:sz w:val="21"/>
-          <w:szCs w:val="21"/>
-          <w:lang w:eastAsia="en-IN"/>
-          <w14:ligatures w14:val="none"/>
-        </w:rPr>
-        <w:t>:</w:t>
+          <w:color w:val="3B3B3B"/>
+          <w:kern w:val="0"/>
+          <w:sz w:val="21"/>
+          <w:szCs w:val="21"/>
+          <w:lang w:eastAsia="en-IN"/>
+          <w14:ligatures w14:val="none"/>
+        </w:rPr>
+        <w:t>pool:</w:t>
       </w:r>
     </w:p>
     <w:p>
@@ -1606,45 +1211,7 @@
           <w:lang w:eastAsia="en-IN"/>
           <w14:ligatures w14:val="none"/>
         </w:rPr>
-        <w:t xml:space="preserve">  </w:t>
-      </w:r>
-      <w:proofErr w:type="spellStart"/>
-      <w:r>
-        <w:rPr>
-          <w:rFonts w:ascii="Consolas" w:eastAsia="Times New Roman" w:hAnsi="Consolas" w:cs="Times New Roman"/>
-          <w:color w:val="800000"/>
-          <w:kern w:val="0"/>
-          <w:sz w:val="21"/>
-          <w:szCs w:val="21"/>
-          <w:lang w:eastAsia="en-IN"/>
-          <w14:ligatures w14:val="none"/>
-        </w:rPr>
-        <w:t>vmImage</w:t>
-      </w:r>
-      <w:proofErr w:type="spellEnd"/>
-      <w:r>
-        <w:rPr>
-          <w:rFonts w:ascii="Consolas" w:eastAsia="Times New Roman" w:hAnsi="Consolas" w:cs="Times New Roman"/>
-          <w:color w:val="3B3B3B"/>
-          <w:kern w:val="0"/>
-          <w:sz w:val="21"/>
-          <w:szCs w:val="21"/>
-          <w:lang w:eastAsia="en-IN"/>
-          <w14:ligatures w14:val="none"/>
-        </w:rPr>
-        <w:t xml:space="preserve">: </w:t>
-      </w:r>
-      <w:r>
-        <w:rPr>
-          <w:rFonts w:ascii="Consolas" w:eastAsia="Times New Roman" w:hAnsi="Consolas" w:cs="Times New Roman"/>
-          <w:color w:val="0000FF"/>
-          <w:kern w:val="0"/>
-          <w:sz w:val="21"/>
-          <w:szCs w:val="21"/>
-          <w:lang w:eastAsia="en-IN"/>
-          <w14:ligatures w14:val="none"/>
-        </w:rPr>
-        <w:t>ubuntu-latest</w:t>
+        <w:t xml:space="preserve">  vmImage: ubuntu-latest</w:t>
       </w:r>
     </w:p>
     <w:p>
@@ -1679,26 +1246,14 @@
       <w:r>
         <w:rPr>
           <w:rFonts w:ascii="Consolas" w:eastAsia="Times New Roman" w:hAnsi="Consolas" w:cs="Times New Roman"/>
-          <w:color w:val="800000"/>
-          <w:kern w:val="0"/>
-          <w:sz w:val="21"/>
-          <w:szCs w:val="21"/>
-          <w:lang w:eastAsia="en-IN"/>
-          <w14:ligatures w14:val="none"/>
-        </w:rPr>
-        <w:t>steps</w:t>
-      </w:r>
-      <w:r>
-        <w:rPr>
-          <w:rFonts w:ascii="Consolas" w:eastAsia="Times New Roman" w:hAnsi="Consolas" w:cs="Times New Roman"/>
-          <w:color w:val="3B3B3B"/>
-          <w:kern w:val="0"/>
-          <w:sz w:val="21"/>
-          <w:szCs w:val="21"/>
-          <w:lang w:eastAsia="en-IN"/>
-          <w14:ligatures w14:val="none"/>
-        </w:rPr>
-        <w:t>:</w:t>
+          <w:color w:val="3B3B3B"/>
+          <w:kern w:val="0"/>
+          <w:sz w:val="21"/>
+          <w:szCs w:val="21"/>
+          <w:lang w:eastAsia="en-IN"/>
+          <w14:ligatures w14:val="none"/>
+        </w:rPr>
+        <w:t>steps:</w:t>
       </w:r>
     </w:p>
     <w:p>
@@ -1725,43 +1280,7 @@
           <w:lang w:eastAsia="en-IN"/>
           <w14:ligatures w14:val="none"/>
         </w:rPr>
-        <w:t xml:space="preserve">- </w:t>
-      </w:r>
-      <w:r>
-        <w:rPr>
-          <w:rFonts w:ascii="Consolas" w:eastAsia="Times New Roman" w:hAnsi="Consolas" w:cs="Times New Roman"/>
-          <w:color w:val="800000"/>
-          <w:kern w:val="0"/>
-          <w:sz w:val="21"/>
-          <w:szCs w:val="21"/>
-          <w:lang w:eastAsia="en-IN"/>
-          <w14:ligatures w14:val="none"/>
-        </w:rPr>
-        <w:t>checkout</w:t>
-      </w:r>
-      <w:r>
-        <w:rPr>
-          <w:rFonts w:ascii="Consolas" w:eastAsia="Times New Roman" w:hAnsi="Consolas" w:cs="Times New Roman"/>
-          <w:color w:val="3B3B3B"/>
-          <w:kern w:val="0"/>
-          <w:sz w:val="21"/>
-          <w:szCs w:val="21"/>
-          <w:lang w:eastAsia="en-IN"/>
-          <w14:ligatures w14:val="none"/>
-        </w:rPr>
-        <w:t xml:space="preserve">: </w:t>
-      </w:r>
-      <w:r>
-        <w:rPr>
-          <w:rFonts w:ascii="Consolas" w:eastAsia="Times New Roman" w:hAnsi="Consolas" w:cs="Times New Roman"/>
-          <w:color w:val="0000FF"/>
-          <w:kern w:val="0"/>
-          <w:sz w:val="21"/>
-          <w:szCs w:val="21"/>
-          <w:lang w:eastAsia="en-IN"/>
-          <w14:ligatures w14:val="none"/>
-        </w:rPr>
-        <w:t>self</w:t>
+        <w:t>- checkout: self</w:t>
       </w:r>
     </w:p>
     <w:p>
@@ -1778,6 +1297,18 @@
           <w14:ligatures w14:val="none"/>
         </w:rPr>
       </w:pPr>
+      <w:r>
+        <w:rPr>
+          <w:rFonts w:ascii="Consolas" w:eastAsia="Times New Roman" w:hAnsi="Consolas" w:cs="Times New Roman"/>
+          <w:color w:val="3B3B3B"/>
+          <w:kern w:val="0"/>
+          <w:sz w:val="21"/>
+          <w:szCs w:val="21"/>
+          <w:lang w:eastAsia="en-IN"/>
+          <w14:ligatures w14:val="none"/>
+        </w:rPr>
+        <w:t xml:space="preserve">  persistCredentials: true</w:t>
+      </w:r>
     </w:p>
     <w:p>
       <w:pPr>
@@ -1793,54 +1324,6 @@
           <w14:ligatures w14:val="none"/>
         </w:rPr>
       </w:pPr>
-      <w:r>
-        <w:rPr>
-          <w:rFonts w:ascii="Consolas" w:eastAsia="Times New Roman" w:hAnsi="Consolas" w:cs="Times New Roman"/>
-          <w:color w:val="3B3B3B"/>
-          <w:kern w:val="0"/>
-          <w:sz w:val="21"/>
-          <w:szCs w:val="21"/>
-          <w:lang w:eastAsia="en-IN"/>
-          <w14:ligatures w14:val="none"/>
-        </w:rPr>
-        <w:t xml:space="preserve">- </w:t>
-      </w:r>
-      <w:r>
-        <w:rPr>
-          <w:rFonts w:ascii="Consolas" w:eastAsia="Times New Roman" w:hAnsi="Consolas" w:cs="Times New Roman"/>
-          <w:color w:val="800000"/>
-          <w:kern w:val="0"/>
-          <w:sz w:val="21"/>
-          <w:szCs w:val="21"/>
-          <w:lang w:eastAsia="en-IN"/>
-          <w14:ligatures w14:val="none"/>
-        </w:rPr>
-        <w:t>task</w:t>
-      </w:r>
-      <w:r>
-        <w:rPr>
-          <w:rFonts w:ascii="Consolas" w:eastAsia="Times New Roman" w:hAnsi="Consolas" w:cs="Times New Roman"/>
-          <w:color w:val="3B3B3B"/>
-          <w:kern w:val="0"/>
-          <w:sz w:val="21"/>
-          <w:szCs w:val="21"/>
-          <w:lang w:eastAsia="en-IN"/>
-          <w14:ligatures w14:val="none"/>
-        </w:rPr>
-        <w:t xml:space="preserve">: </w:t>
-      </w:r>
-      <w:r>
-        <w:rPr>
-          <w:rFonts w:ascii="Consolas" w:eastAsia="Times New Roman" w:hAnsi="Consolas" w:cs="Times New Roman"/>
-          <w:color w:val="0000FF"/>
-          <w:kern w:val="0"/>
-          <w:sz w:val="21"/>
-          <w:szCs w:val="21"/>
-          <w:lang w:eastAsia="en-IN"/>
-          <w14:ligatures w14:val="none"/>
-        </w:rPr>
-        <w:t>Docker@2</w:t>
-      </w:r>
     </w:p>
     <w:p>
       <w:pPr>
@@ -1866,45 +1349,7 @@
           <w:lang w:eastAsia="en-IN"/>
           <w14:ligatures w14:val="none"/>
         </w:rPr>
-        <w:t xml:space="preserve">  </w:t>
-      </w:r>
-      <w:proofErr w:type="spellStart"/>
-      <w:r>
-        <w:rPr>
-          <w:rFonts w:ascii="Consolas" w:eastAsia="Times New Roman" w:hAnsi="Consolas" w:cs="Times New Roman"/>
-          <w:color w:val="800000"/>
-          <w:kern w:val="0"/>
-          <w:sz w:val="21"/>
-          <w:szCs w:val="21"/>
-          <w:lang w:eastAsia="en-IN"/>
-          <w14:ligatures w14:val="none"/>
-        </w:rPr>
-        <w:t>displayName</w:t>
-      </w:r>
-      <w:proofErr w:type="spellEnd"/>
-      <w:r>
-        <w:rPr>
-          <w:rFonts w:ascii="Consolas" w:eastAsia="Times New Roman" w:hAnsi="Consolas" w:cs="Times New Roman"/>
-          <w:color w:val="3B3B3B"/>
-          <w:kern w:val="0"/>
-          <w:sz w:val="21"/>
-          <w:szCs w:val="21"/>
-          <w:lang w:eastAsia="en-IN"/>
-          <w14:ligatures w14:val="none"/>
-        </w:rPr>
-        <w:t xml:space="preserve">: </w:t>
-      </w:r>
-      <w:r>
-        <w:rPr>
-          <w:rFonts w:ascii="Consolas" w:eastAsia="Times New Roman" w:hAnsi="Consolas" w:cs="Times New Roman"/>
-          <w:color w:val="0000FF"/>
-          <w:kern w:val="0"/>
-          <w:sz w:val="21"/>
-          <w:szCs w:val="21"/>
-          <w:lang w:eastAsia="en-IN"/>
-          <w14:ligatures w14:val="none"/>
-        </w:rPr>
-        <w:t>Build and Push Image</w:t>
+        <w:t>- task: Docker@2</w:t>
       </w:r>
     </w:p>
     <w:p>
@@ -1931,31 +1376,7 @@
           <w:lang w:eastAsia="en-IN"/>
           <w14:ligatures w14:val="none"/>
         </w:rPr>
-        <w:t xml:space="preserve">  </w:t>
-      </w:r>
-      <w:r>
-        <w:rPr>
-          <w:rFonts w:ascii="Consolas" w:eastAsia="Times New Roman" w:hAnsi="Consolas" w:cs="Times New Roman"/>
-          <w:color w:val="800000"/>
-          <w:kern w:val="0"/>
-          <w:sz w:val="21"/>
-          <w:szCs w:val="21"/>
-          <w:lang w:eastAsia="en-IN"/>
-          <w14:ligatures w14:val="none"/>
-        </w:rPr>
-        <w:t>inputs</w:t>
-      </w:r>
-      <w:r>
-        <w:rPr>
-          <w:rFonts w:ascii="Consolas" w:eastAsia="Times New Roman" w:hAnsi="Consolas" w:cs="Times New Roman"/>
-          <w:color w:val="3B3B3B"/>
-          <w:kern w:val="0"/>
-          <w:sz w:val="21"/>
-          <w:szCs w:val="21"/>
-          <w:lang w:eastAsia="en-IN"/>
-          <w14:ligatures w14:val="none"/>
-        </w:rPr>
-        <w:t>:</w:t>
+        <w:t xml:space="preserve">  displayName: Build and Push Image</w:t>
       </w:r>
     </w:p>
     <w:p>
@@ -1982,46 +1403,8 @@
           <w:lang w:eastAsia="en-IN"/>
           <w14:ligatures w14:val="none"/>
         </w:rPr>
-        <w:t xml:space="preserve">    </w:t>
-      </w:r>
-      <w:r>
-        <w:rPr>
-          <w:rFonts w:ascii="Consolas" w:eastAsia="Times New Roman" w:hAnsi="Consolas" w:cs="Times New Roman"/>
-          <w:color w:val="800000"/>
-          <w:kern w:val="0"/>
-          <w:sz w:val="21"/>
-          <w:szCs w:val="21"/>
-          <w:lang w:eastAsia="en-IN"/>
-          <w14:ligatures w14:val="none"/>
-        </w:rPr>
-        <w:t>command</w:t>
-      </w:r>
-      <w:r>
-        <w:rPr>
-          <w:rFonts w:ascii="Consolas" w:eastAsia="Times New Roman" w:hAnsi="Consolas" w:cs="Times New Roman"/>
-          <w:color w:val="3B3B3B"/>
-          <w:kern w:val="0"/>
-          <w:sz w:val="21"/>
-          <w:szCs w:val="21"/>
-          <w:lang w:eastAsia="en-IN"/>
-          <w14:ligatures w14:val="none"/>
-        </w:rPr>
-        <w:t xml:space="preserve">: </w:t>
-      </w:r>
-      <w:proofErr w:type="spellStart"/>
-      <w:r>
-        <w:rPr>
-          <w:rFonts w:ascii="Consolas" w:eastAsia="Times New Roman" w:hAnsi="Consolas" w:cs="Times New Roman"/>
-          <w:color w:val="0000FF"/>
-          <w:kern w:val="0"/>
-          <w:sz w:val="21"/>
-          <w:szCs w:val="21"/>
-          <w:lang w:eastAsia="en-IN"/>
-          <w14:ligatures w14:val="none"/>
-        </w:rPr>
-        <w:t>buildAndPush</w:t>
-      </w:r>
-      <w:proofErr w:type="spellEnd"/>
+        <w:t xml:space="preserve">  inputs:</w:t>
+      </w:r>
     </w:p>
     <w:p>
       <w:pPr>
@@ -2047,69 +1430,7 @@
           <w:lang w:eastAsia="en-IN"/>
           <w14:ligatures w14:val="none"/>
         </w:rPr>
-        <w:t xml:space="preserve">    </w:t>
-      </w:r>
-      <w:r>
-        <w:rPr>
-          <w:rFonts w:ascii="Consolas" w:eastAsia="Times New Roman" w:hAnsi="Consolas" w:cs="Times New Roman"/>
-          <w:color w:val="800000"/>
-          <w:kern w:val="0"/>
-          <w:sz w:val="21"/>
-          <w:szCs w:val="21"/>
-          <w:lang w:eastAsia="en-IN"/>
-          <w14:ligatures w14:val="none"/>
-        </w:rPr>
-        <w:t>repository</w:t>
-      </w:r>
-      <w:r>
-        <w:rPr>
-          <w:rFonts w:ascii="Consolas" w:eastAsia="Times New Roman" w:hAnsi="Consolas" w:cs="Times New Roman"/>
-          <w:color w:val="3B3B3B"/>
-          <w:kern w:val="0"/>
-          <w:sz w:val="21"/>
-          <w:szCs w:val="21"/>
-          <w:lang w:eastAsia="en-IN"/>
-          <w14:ligatures w14:val="none"/>
-        </w:rPr>
-        <w:t xml:space="preserve">: </w:t>
-      </w:r>
-      <w:r>
-        <w:rPr>
-          <w:rFonts w:ascii="Consolas" w:eastAsia="Times New Roman" w:hAnsi="Consolas" w:cs="Times New Roman"/>
-          <w:color w:val="0000FF"/>
-          <w:kern w:val="0"/>
-          <w:sz w:val="21"/>
-          <w:szCs w:val="21"/>
-          <w:lang w:eastAsia="en-IN"/>
-          <w14:ligatures w14:val="none"/>
-        </w:rPr>
-        <w:t>$(</w:t>
-      </w:r>
-      <w:proofErr w:type="spellStart"/>
-      <w:r>
-        <w:rPr>
-          <w:rFonts w:ascii="Consolas" w:eastAsia="Times New Roman" w:hAnsi="Consolas" w:cs="Times New Roman"/>
-          <w:color w:val="0000FF"/>
-          <w:kern w:val="0"/>
-          <w:sz w:val="21"/>
-          <w:szCs w:val="21"/>
-          <w:lang w:eastAsia="en-IN"/>
-          <w14:ligatures w14:val="none"/>
-        </w:rPr>
-        <w:t>imageName</w:t>
-      </w:r>
-      <w:proofErr w:type="spellEnd"/>
-      <w:r>
-        <w:rPr>
-          <w:rFonts w:ascii="Consolas" w:eastAsia="Times New Roman" w:hAnsi="Consolas" w:cs="Times New Roman"/>
-          <w:color w:val="0000FF"/>
-          <w:kern w:val="0"/>
-          <w:sz w:val="21"/>
-          <w:szCs w:val="21"/>
-          <w:lang w:eastAsia="en-IN"/>
-          <w14:ligatures w14:val="none"/>
-        </w:rPr>
-        <w:t>)</w:t>
+        <w:t xml:space="preserve">    command: buildAndPush</w:t>
       </w:r>
     </w:p>
     <w:p>
@@ -2136,43 +1457,7 @@
           <w:lang w:eastAsia="en-IN"/>
           <w14:ligatures w14:val="none"/>
         </w:rPr>
-        <w:t xml:space="preserve">    </w:t>
-      </w:r>
-      <w:r>
-        <w:rPr>
-          <w:rFonts w:ascii="Consolas" w:eastAsia="Times New Roman" w:hAnsi="Consolas" w:cs="Times New Roman"/>
-          <w:color w:val="800000"/>
-          <w:kern w:val="0"/>
-          <w:sz w:val="21"/>
-          <w:szCs w:val="21"/>
-          <w:lang w:eastAsia="en-IN"/>
-          <w14:ligatures w14:val="none"/>
-        </w:rPr>
-        <w:t>dockerfile</w:t>
-      </w:r>
-      <w:r>
-        <w:rPr>
-          <w:rFonts w:ascii="Consolas" w:eastAsia="Times New Roman" w:hAnsi="Consolas" w:cs="Times New Roman"/>
-          <w:color w:val="3B3B3B"/>
-          <w:kern w:val="0"/>
-          <w:sz w:val="21"/>
-          <w:szCs w:val="21"/>
-          <w:lang w:eastAsia="en-IN"/>
-          <w14:ligatures w14:val="none"/>
-        </w:rPr>
-        <w:t xml:space="preserve">: </w:t>
-      </w:r>
-      <w:r>
-        <w:rPr>
-          <w:rFonts w:ascii="Consolas" w:eastAsia="Times New Roman" w:hAnsi="Consolas" w:cs="Times New Roman"/>
-          <w:color w:val="0000FF"/>
-          <w:kern w:val="0"/>
-          <w:sz w:val="21"/>
-          <w:szCs w:val="21"/>
-          <w:lang w:eastAsia="en-IN"/>
-          <w14:ligatures w14:val="none"/>
-        </w:rPr>
-        <w:t>Dockerfile</w:t>
+        <w:t xml:space="preserve">    repository: $(imageName)</w:t>
       </w:r>
     </w:p>
     <w:p>
@@ -2199,45 +1484,7 @@
           <w:lang w:eastAsia="en-IN"/>
           <w14:ligatures w14:val="none"/>
         </w:rPr>
-        <w:t xml:space="preserve">    </w:t>
-      </w:r>
-      <w:proofErr w:type="spellStart"/>
-      <w:r>
-        <w:rPr>
-          <w:rFonts w:ascii="Consolas" w:eastAsia="Times New Roman" w:hAnsi="Consolas" w:cs="Times New Roman"/>
-          <w:color w:val="800000"/>
-          <w:kern w:val="0"/>
-          <w:sz w:val="21"/>
-          <w:szCs w:val="21"/>
-          <w:lang w:eastAsia="en-IN"/>
-          <w14:ligatures w14:val="none"/>
-        </w:rPr>
-        <w:t>containerRegistry</w:t>
-      </w:r>
-      <w:proofErr w:type="spellEnd"/>
-      <w:r>
-        <w:rPr>
-          <w:rFonts w:ascii="Consolas" w:eastAsia="Times New Roman" w:hAnsi="Consolas" w:cs="Times New Roman"/>
-          <w:color w:val="3B3B3B"/>
-          <w:kern w:val="0"/>
-          <w:sz w:val="21"/>
-          <w:szCs w:val="21"/>
-          <w:lang w:eastAsia="en-IN"/>
-          <w14:ligatures w14:val="none"/>
-        </w:rPr>
-        <w:t xml:space="preserve">: </w:t>
-      </w:r>
-      <w:r>
-        <w:rPr>
-          <w:rFonts w:ascii="Consolas" w:eastAsia="Times New Roman" w:hAnsi="Consolas" w:cs="Times New Roman"/>
-          <w:color w:val="0000FF"/>
-          <w:kern w:val="0"/>
-          <w:sz w:val="21"/>
-          <w:szCs w:val="21"/>
-          <w:lang w:eastAsia="en-IN"/>
-          <w14:ligatures w14:val="none"/>
-        </w:rPr>
-        <w:t>ACR-Service-Connection</w:t>
+        <w:t xml:space="preserve">    dockerfile: Dockerfile</w:t>
       </w:r>
     </w:p>
     <w:p>
@@ -2264,43 +1511,7 @@
           <w:lang w:eastAsia="en-IN"/>
           <w14:ligatures w14:val="none"/>
         </w:rPr>
-        <w:t xml:space="preserve">    </w:t>
-      </w:r>
-      <w:r>
-        <w:rPr>
-          <w:rFonts w:ascii="Consolas" w:eastAsia="Times New Roman" w:hAnsi="Consolas" w:cs="Times New Roman"/>
-          <w:color w:val="800000"/>
-          <w:kern w:val="0"/>
-          <w:sz w:val="21"/>
-          <w:szCs w:val="21"/>
-          <w:lang w:eastAsia="en-IN"/>
-          <w14:ligatures w14:val="none"/>
-        </w:rPr>
-        <w:t>tags</w:t>
-      </w:r>
-      <w:r>
-        <w:rPr>
-          <w:rFonts w:ascii="Consolas" w:eastAsia="Times New Roman" w:hAnsi="Consolas" w:cs="Times New Roman"/>
-          <w:color w:val="3B3B3B"/>
-          <w:kern w:val="0"/>
-          <w:sz w:val="21"/>
-          <w:szCs w:val="21"/>
-          <w:lang w:eastAsia="en-IN"/>
-          <w14:ligatures w14:val="none"/>
-        </w:rPr>
-        <w:t xml:space="preserve">: </w:t>
-      </w:r>
-      <w:r>
-        <w:rPr>
-          <w:rFonts w:ascii="Consolas" w:eastAsia="Times New Roman" w:hAnsi="Consolas" w:cs="Times New Roman"/>
-          <w:color w:val="AF00DB"/>
-          <w:kern w:val="0"/>
-          <w:sz w:val="21"/>
-          <w:szCs w:val="21"/>
-          <w:lang w:eastAsia="en-IN"/>
-          <w14:ligatures w14:val="none"/>
-        </w:rPr>
-        <w:t>|</w:t>
+        <w:t xml:space="preserve">    containerRegistry: clahandevops123</w:t>
       </w:r>
     </w:p>
     <w:p>
@@ -2320,14 +1531,14 @@
       <w:r>
         <w:rPr>
           <w:rFonts w:ascii="Consolas" w:eastAsia="Times New Roman" w:hAnsi="Consolas" w:cs="Times New Roman"/>
-          <w:color w:val="0000FF"/>
-          <w:kern w:val="0"/>
-          <w:sz w:val="21"/>
-          <w:szCs w:val="21"/>
-          <w:lang w:eastAsia="en-IN"/>
-          <w14:ligatures w14:val="none"/>
-        </w:rPr>
-        <w:t>      $(tag)</w:t>
+          <w:color w:val="3B3B3B"/>
+          <w:kern w:val="0"/>
+          <w:sz w:val="21"/>
+          <w:szCs w:val="21"/>
+          <w:lang w:eastAsia="en-IN"/>
+          <w14:ligatures w14:val="none"/>
+        </w:rPr>
+        <w:t xml:space="preserve">    tags: |</w:t>
       </w:r>
     </w:p>
     <w:p>
@@ -2344,6 +1555,18 @@
           <w14:ligatures w14:val="none"/>
         </w:rPr>
       </w:pPr>
+      <w:r>
+        <w:rPr>
+          <w:rFonts w:ascii="Consolas" w:eastAsia="Times New Roman" w:hAnsi="Consolas" w:cs="Times New Roman"/>
+          <w:color w:val="3B3B3B"/>
+          <w:kern w:val="0"/>
+          <w:sz w:val="21"/>
+          <w:szCs w:val="21"/>
+          <w:lang w:eastAsia="en-IN"/>
+          <w14:ligatures w14:val="none"/>
+        </w:rPr>
+        <w:t xml:space="preserve">      $(tag)</w:t>
+      </w:r>
     </w:p>
     <w:p>
       <w:pPr>
@@ -2359,34 +1582,6 @@
           <w14:ligatures w14:val="none"/>
         </w:rPr>
       </w:pPr>
-      <w:r>
-        <w:rPr>
-          <w:rFonts w:ascii="Consolas" w:eastAsia="Times New Roman" w:hAnsi="Consolas" w:cs="Times New Roman"/>
-          <w:color w:val="008000"/>
-          <w:kern w:val="0"/>
-          <w:sz w:val="21"/>
-          <w:szCs w:val="21"/>
-          <w:lang w:eastAsia="en-IN"/>
-          <w14:ligatures w14:val="none"/>
-        </w:rPr>
-        <w:t xml:space="preserve"># Update Helm </w:t>
-      </w:r>
-      <w:proofErr w:type="spellStart"/>
-      <w:proofErr w:type="gramStart"/>
-      <w:r>
-        <w:rPr>
-          <w:rFonts w:ascii="Consolas" w:eastAsia="Times New Roman" w:hAnsi="Consolas" w:cs="Times New Roman"/>
-          <w:color w:val="008000"/>
-          <w:kern w:val="0"/>
-          <w:sz w:val="21"/>
-          <w:szCs w:val="21"/>
-          <w:lang w:eastAsia="en-IN"/>
-          <w14:ligatures w14:val="none"/>
-        </w:rPr>
-        <w:t>values.yaml</w:t>
-      </w:r>
-      <w:proofErr w:type="spellEnd"/>
-      <w:proofErr w:type="gramEnd"/>
     </w:p>
     <w:p>
       <w:pPr>
@@ -2412,43 +1607,7 @@
           <w:lang w:eastAsia="en-IN"/>
           <w14:ligatures w14:val="none"/>
         </w:rPr>
-        <w:t xml:space="preserve">- </w:t>
-      </w:r>
-      <w:r>
-        <w:rPr>
-          <w:rFonts w:ascii="Consolas" w:eastAsia="Times New Roman" w:hAnsi="Consolas" w:cs="Times New Roman"/>
-          <w:color w:val="800000"/>
-          <w:kern w:val="0"/>
-          <w:sz w:val="21"/>
-          <w:szCs w:val="21"/>
-          <w:lang w:eastAsia="en-IN"/>
-          <w14:ligatures w14:val="none"/>
-        </w:rPr>
-        <w:t>script</w:t>
-      </w:r>
-      <w:r>
-        <w:rPr>
-          <w:rFonts w:ascii="Consolas" w:eastAsia="Times New Roman" w:hAnsi="Consolas" w:cs="Times New Roman"/>
-          <w:color w:val="3B3B3B"/>
-          <w:kern w:val="0"/>
-          <w:sz w:val="21"/>
-          <w:szCs w:val="21"/>
-          <w:lang w:eastAsia="en-IN"/>
-          <w14:ligatures w14:val="none"/>
-        </w:rPr>
-        <w:t xml:space="preserve">: </w:t>
-      </w:r>
-      <w:r>
-        <w:rPr>
-          <w:rFonts w:ascii="Consolas" w:eastAsia="Times New Roman" w:hAnsi="Consolas" w:cs="Times New Roman"/>
-          <w:color w:val="AF00DB"/>
-          <w:kern w:val="0"/>
-          <w:sz w:val="21"/>
-          <w:szCs w:val="21"/>
-          <w:lang w:eastAsia="en-IN"/>
-          <w14:ligatures w14:val="none"/>
-        </w:rPr>
-        <w:t>|</w:t>
+        <w:t>- script: |</w:t>
       </w:r>
     </w:p>
     <w:p>
@@ -2468,107 +1627,15 @@
       <w:r>
         <w:rPr>
           <w:rFonts w:ascii="Consolas" w:eastAsia="Times New Roman" w:hAnsi="Consolas" w:cs="Times New Roman"/>
-          <w:color w:val="0000FF"/>
-          <w:kern w:val="0"/>
-          <w:sz w:val="21"/>
-          <w:szCs w:val="21"/>
-          <w:lang w:eastAsia="en-IN"/>
-          <w14:ligatures w14:val="none"/>
-        </w:rPr>
-        <w:t xml:space="preserve">    </w:t>
-      </w:r>
-      <w:proofErr w:type="spellStart"/>
-      <w:r>
-        <w:rPr>
-          <w:rFonts w:ascii="Consolas" w:eastAsia="Times New Roman" w:hAnsi="Consolas" w:cs="Times New Roman"/>
-          <w:color w:val="0000FF"/>
-          <w:kern w:val="0"/>
-          <w:sz w:val="21"/>
-          <w:szCs w:val="21"/>
-          <w:lang w:eastAsia="en-IN"/>
-          <w14:ligatures w14:val="none"/>
-        </w:rPr>
-        <w:t>sed</w:t>
-      </w:r>
-      <w:proofErr w:type="spellEnd"/>
-      <w:r>
-        <w:rPr>
-          <w:rFonts w:ascii="Consolas" w:eastAsia="Times New Roman" w:hAnsi="Consolas" w:cs="Times New Roman"/>
-          <w:color w:val="0000FF"/>
-          <w:kern w:val="0"/>
-          <w:sz w:val="21"/>
-          <w:szCs w:val="21"/>
-          <w:lang w:eastAsia="en-IN"/>
-          <w14:ligatures w14:val="none"/>
-        </w:rPr>
-        <w:t xml:space="preserve"> -</w:t>
-      </w:r>
-      <w:proofErr w:type="spellStart"/>
-      <w:r>
-        <w:rPr>
-          <w:rFonts w:ascii="Consolas" w:eastAsia="Times New Roman" w:hAnsi="Consolas" w:cs="Times New Roman"/>
-          <w:color w:val="0000FF"/>
-          <w:kern w:val="0"/>
-          <w:sz w:val="21"/>
-          <w:szCs w:val="21"/>
-          <w:lang w:eastAsia="en-IN"/>
-          <w14:ligatures w14:val="none"/>
-        </w:rPr>
-        <w:t>i</w:t>
-      </w:r>
-      <w:proofErr w:type="spellEnd"/>
-      <w:r>
-        <w:rPr>
-          <w:rFonts w:ascii="Consolas" w:eastAsia="Times New Roman" w:hAnsi="Consolas" w:cs="Times New Roman"/>
-          <w:color w:val="0000FF"/>
-          <w:kern w:val="0"/>
-          <w:sz w:val="21"/>
-          <w:szCs w:val="21"/>
-          <w:lang w:eastAsia="en-IN"/>
-          <w14:ligatures w14:val="none"/>
-        </w:rPr>
-        <w:t xml:space="preserve"> "s/</w:t>
-      </w:r>
-      <w:proofErr w:type="gramStart"/>
-      <w:r>
-        <w:rPr>
-          <w:rFonts w:ascii="Consolas" w:eastAsia="Times New Roman" w:hAnsi="Consolas" w:cs="Times New Roman"/>
-          <w:color w:val="0000FF"/>
-          <w:kern w:val="0"/>
-          <w:sz w:val="21"/>
-          <w:szCs w:val="21"/>
-          <w:lang w:eastAsia="en-IN"/>
-          <w14:ligatures w14:val="none"/>
-        </w:rPr>
-        <w:t>tag:.</w:t>
-      </w:r>
-      <w:proofErr w:type="gramEnd"/>
-      <w:r>
-        <w:rPr>
-          <w:rFonts w:ascii="Consolas" w:eastAsia="Times New Roman" w:hAnsi="Consolas" w:cs="Times New Roman"/>
-          <w:color w:val="0000FF"/>
-          <w:kern w:val="0"/>
-          <w:sz w:val="21"/>
-          <w:szCs w:val="21"/>
-          <w:lang w:eastAsia="en-IN"/>
-          <w14:ligatures w14:val="none"/>
-        </w:rPr>
-        <w:t>*/tag: \"$(tag)\"/" helm/fitness-app/</w:t>
-      </w:r>
-      <w:proofErr w:type="spellStart"/>
-      <w:r>
-        <w:rPr>
-          <w:rFonts w:ascii="Consolas" w:eastAsia="Times New Roman" w:hAnsi="Consolas" w:cs="Times New Roman"/>
-          <w:color w:val="0000FF"/>
-          <w:kern w:val="0"/>
-          <w:sz w:val="21"/>
-          <w:szCs w:val="21"/>
-          <w:lang w:eastAsia="en-IN"/>
-          <w14:ligatures w14:val="none"/>
-        </w:rPr>
-        <w:t>values.yaml</w:t>
-      </w:r>
-      <w:proofErr w:type="spellEnd"/>
+          <w:color w:val="3B3B3B"/>
+          <w:kern w:val="0"/>
+          <w:sz w:val="21"/>
+          <w:szCs w:val="21"/>
+          <w:lang w:eastAsia="en-IN"/>
+          <w14:ligatures w14:val="none"/>
+        </w:rPr>
+        <w:t xml:space="preserve">    echo "Updating Helm values.yaml"</w:t>
+      </w:r>
     </w:p>
     <w:p>
       <w:pPr>
@@ -2584,46 +1651,6 @@
           <w14:ligatures w14:val="none"/>
         </w:rPr>
       </w:pPr>
-      <w:r>
-        <w:rPr>
-          <w:rFonts w:ascii="Consolas" w:eastAsia="Times New Roman" w:hAnsi="Consolas" w:cs="Times New Roman"/>
-          <w:color w:val="0000FF"/>
-          <w:kern w:val="0"/>
-          <w:sz w:val="21"/>
-          <w:szCs w:val="21"/>
-          <w:lang w:eastAsia="en-IN"/>
-          <w14:ligatures w14:val="none"/>
-        </w:rPr>
-        <w:t xml:space="preserve">    git config </w:t>
-      </w:r>
-      <w:proofErr w:type="spellStart"/>
-      <w:proofErr w:type="gramStart"/>
-      <w:r>
-        <w:rPr>
-          <w:rFonts w:ascii="Consolas" w:eastAsia="Times New Roman" w:hAnsi="Consolas" w:cs="Times New Roman"/>
-          <w:color w:val="0000FF"/>
-          <w:kern w:val="0"/>
-          <w:sz w:val="21"/>
-          <w:szCs w:val="21"/>
-          <w:lang w:eastAsia="en-IN"/>
-          <w14:ligatures w14:val="none"/>
-        </w:rPr>
-        <w:t>user.email</w:t>
-      </w:r>
-      <w:proofErr w:type="spellEnd"/>
-      <w:proofErr w:type="gramEnd"/>
-      <w:r>
-        <w:rPr>
-          <w:rFonts w:ascii="Consolas" w:eastAsia="Times New Roman" w:hAnsi="Consolas" w:cs="Times New Roman"/>
-          <w:color w:val="0000FF"/>
-          <w:kern w:val="0"/>
-          <w:sz w:val="21"/>
-          <w:szCs w:val="21"/>
-          <w:lang w:eastAsia="en-IN"/>
-          <w14:ligatures w14:val="none"/>
-        </w:rPr>
-        <w:t xml:space="preserve"> "devops@company.com"</w:t>
-      </w:r>
     </w:p>
     <w:p>
       <w:pPr>
@@ -2642,40 +1669,14 @@
       <w:r>
         <w:rPr>
           <w:rFonts w:ascii="Consolas" w:eastAsia="Times New Roman" w:hAnsi="Consolas" w:cs="Times New Roman"/>
-          <w:color w:val="0000FF"/>
-          <w:kern w:val="0"/>
-          <w:sz w:val="21"/>
-          <w:szCs w:val="21"/>
-          <w:lang w:eastAsia="en-IN"/>
-          <w14:ligatures w14:val="none"/>
-        </w:rPr>
-        <w:t>    git config user.name "azure-</w:t>
-      </w:r>
-      <w:proofErr w:type="spellStart"/>
-      <w:r>
-        <w:rPr>
-          <w:rFonts w:ascii="Consolas" w:eastAsia="Times New Roman" w:hAnsi="Consolas" w:cs="Times New Roman"/>
-          <w:color w:val="0000FF"/>
-          <w:kern w:val="0"/>
-          <w:sz w:val="21"/>
-          <w:szCs w:val="21"/>
-          <w:lang w:eastAsia="en-IN"/>
-          <w14:ligatures w14:val="none"/>
-        </w:rPr>
-        <w:t>devops</w:t>
-      </w:r>
-      <w:proofErr w:type="spellEnd"/>
-      <w:r>
-        <w:rPr>
-          <w:rFonts w:ascii="Consolas" w:eastAsia="Times New Roman" w:hAnsi="Consolas" w:cs="Times New Roman"/>
-          <w:color w:val="0000FF"/>
-          <w:kern w:val="0"/>
-          <w:sz w:val="21"/>
-          <w:szCs w:val="21"/>
-          <w:lang w:eastAsia="en-IN"/>
-          <w14:ligatures w14:val="none"/>
-        </w:rPr>
-        <w:t>"</w:t>
+          <w:color w:val="3B3B3B"/>
+          <w:kern w:val="0"/>
+          <w:sz w:val="21"/>
+          <w:szCs w:val="21"/>
+          <w:lang w:eastAsia="en-IN"/>
+          <w14:ligatures w14:val="none"/>
+        </w:rPr>
+        <w:t xml:space="preserve">    sed -i "s/tag:.*/tag: \"$(tag)\"/" charts/fitness-app/values.yaml</w:t>
       </w:r>
     </w:p>
     <w:p>
@@ -2692,32 +1693,6 @@
           <w14:ligatures w14:val="none"/>
         </w:rPr>
       </w:pPr>
-      <w:r>
-        <w:rPr>
-          <w:rFonts w:ascii="Consolas" w:eastAsia="Times New Roman" w:hAnsi="Consolas" w:cs="Times New Roman"/>
-          <w:color w:val="0000FF"/>
-          <w:kern w:val="0"/>
-          <w:sz w:val="21"/>
-          <w:szCs w:val="21"/>
-          <w:lang w:eastAsia="en-IN"/>
-          <w14:ligatures w14:val="none"/>
-        </w:rPr>
-        <w:t>    git add helm/fitness-app/</w:t>
-      </w:r>
-      <w:proofErr w:type="spellStart"/>
-      <w:r>
-        <w:rPr>
-          <w:rFonts w:ascii="Consolas" w:eastAsia="Times New Roman" w:hAnsi="Consolas" w:cs="Times New Roman"/>
-          <w:color w:val="0000FF"/>
-          <w:kern w:val="0"/>
-          <w:sz w:val="21"/>
-          <w:szCs w:val="21"/>
-          <w:lang w:eastAsia="en-IN"/>
-          <w14:ligatures w14:val="none"/>
-        </w:rPr>
-        <w:t>values.yaml</w:t>
-      </w:r>
-      <w:proofErr w:type="spellEnd"/>
     </w:p>
     <w:p>
       <w:pPr>
@@ -2736,14 +1711,14 @@
       <w:r>
         <w:rPr>
           <w:rFonts w:ascii="Consolas" w:eastAsia="Times New Roman" w:hAnsi="Consolas" w:cs="Times New Roman"/>
-          <w:color w:val="0000FF"/>
-          <w:kern w:val="0"/>
-          <w:sz w:val="21"/>
-          <w:szCs w:val="21"/>
-          <w:lang w:eastAsia="en-IN"/>
-          <w14:ligatures w14:val="none"/>
-        </w:rPr>
-        <w:t>    git commit -m "Update image tag to $(tag)"</w:t>
+          <w:color w:val="3B3B3B"/>
+          <w:kern w:val="0"/>
+          <w:sz w:val="21"/>
+          <w:szCs w:val="21"/>
+          <w:lang w:eastAsia="en-IN"/>
+          <w14:ligatures w14:val="none"/>
+        </w:rPr>
+        <w:t xml:space="preserve">    git config user.email "azure-devops@pipeline.com"</w:t>
       </w:r>
     </w:p>
     <w:p>
@@ -2763,40 +1738,14 @@
       <w:r>
         <w:rPr>
           <w:rFonts w:ascii="Consolas" w:eastAsia="Times New Roman" w:hAnsi="Consolas" w:cs="Times New Roman"/>
-          <w:color w:val="0000FF"/>
-          <w:kern w:val="0"/>
-          <w:sz w:val="21"/>
-          <w:szCs w:val="21"/>
-          <w:lang w:eastAsia="en-IN"/>
-          <w14:ligatures w14:val="none"/>
-        </w:rPr>
-        <w:t>    git push origin azure-</w:t>
-      </w:r>
-      <w:proofErr w:type="spellStart"/>
-      <w:r>
-        <w:rPr>
-          <w:rFonts w:ascii="Consolas" w:eastAsia="Times New Roman" w:hAnsi="Consolas" w:cs="Times New Roman"/>
-          <w:color w:val="0000FF"/>
-          <w:kern w:val="0"/>
-          <w:sz w:val="21"/>
-          <w:szCs w:val="21"/>
-          <w:lang w:eastAsia="en-IN"/>
-          <w14:ligatures w14:val="none"/>
-        </w:rPr>
-        <w:t>argo</w:t>
-      </w:r>
-      <w:proofErr w:type="spellEnd"/>
-      <w:r>
-        <w:rPr>
-          <w:rFonts w:ascii="Consolas" w:eastAsia="Times New Roman" w:hAnsi="Consolas" w:cs="Times New Roman"/>
-          <w:color w:val="0000FF"/>
-          <w:kern w:val="0"/>
-          <w:sz w:val="21"/>
-          <w:szCs w:val="21"/>
-          <w:lang w:eastAsia="en-IN"/>
-          <w14:ligatures w14:val="none"/>
-        </w:rPr>
-        <w:t>-GA</w:t>
+          <w:color w:val="3B3B3B"/>
+          <w:kern w:val="0"/>
+          <w:sz w:val="21"/>
+          <w:szCs w:val="21"/>
+          <w:lang w:eastAsia="en-IN"/>
+          <w14:ligatures w14:val="none"/>
+        </w:rPr>
+        <w:t xml:space="preserve">    git config user.name "azure-devops"</w:t>
       </w:r>
     </w:p>
     <w:p>
@@ -2813,56 +1762,6 @@
           <w14:ligatures w14:val="none"/>
         </w:rPr>
       </w:pPr>
-      <w:r>
-        <w:rPr>
-          <w:rFonts w:ascii="Consolas" w:eastAsia="Times New Roman" w:hAnsi="Consolas" w:cs="Times New Roman"/>
-          <w:color w:val="3B3B3B"/>
-          <w:kern w:val="0"/>
-          <w:sz w:val="21"/>
-          <w:szCs w:val="21"/>
-          <w:lang w:eastAsia="en-IN"/>
-          <w14:ligatures w14:val="none"/>
-        </w:rPr>
-        <w:t xml:space="preserve">  </w:t>
-      </w:r>
-      <w:proofErr w:type="spellStart"/>
-      <w:r>
-        <w:rPr>
-          <w:rFonts w:ascii="Consolas" w:eastAsia="Times New Roman" w:hAnsi="Consolas" w:cs="Times New Roman"/>
-          <w:color w:val="800000"/>
-          <w:kern w:val="0"/>
-          <w:sz w:val="21"/>
-          <w:szCs w:val="21"/>
-          <w:lang w:eastAsia="en-IN"/>
-          <w14:ligatures w14:val="none"/>
-        </w:rPr>
-        <w:t>displayName</w:t>
-      </w:r>
-      <w:proofErr w:type="spellEnd"/>
-      <w:r>
-        <w:rPr>
-          <w:rFonts w:ascii="Consolas" w:eastAsia="Times New Roman" w:hAnsi="Consolas" w:cs="Times New Roman"/>
-          <w:color w:val="3B3B3B"/>
-          <w:kern w:val="0"/>
-          <w:sz w:val="21"/>
-          <w:szCs w:val="21"/>
-          <w:lang w:eastAsia="en-IN"/>
-          <w14:ligatures w14:val="none"/>
-        </w:rPr>
-        <w:t xml:space="preserve">: </w:t>
-      </w:r>
-      <w:r>
-        <w:rPr>
-          <w:rFonts w:ascii="Consolas" w:eastAsia="Times New Roman" w:hAnsi="Consolas" w:cs="Times New Roman"/>
-          <w:color w:val="0000FF"/>
-          <w:kern w:val="0"/>
-          <w:sz w:val="21"/>
-          <w:szCs w:val="21"/>
-          <w:lang w:eastAsia="en-IN"/>
-          <w14:ligatures w14:val="none"/>
-        </w:rPr>
-        <w:t>Update Helm values</w:t>
-      </w:r>
     </w:p>
     <w:p>
       <w:pPr>
@@ -2878,6 +1777,237 @@
           <w14:ligatures w14:val="none"/>
         </w:rPr>
       </w:pPr>
+      <w:r>
+        <w:rPr>
+          <w:rFonts w:ascii="Consolas" w:eastAsia="Times New Roman" w:hAnsi="Consolas" w:cs="Times New Roman"/>
+          <w:color w:val="3B3B3B"/>
+          <w:kern w:val="0"/>
+          <w:sz w:val="21"/>
+          <w:szCs w:val="21"/>
+          <w:lang w:eastAsia="en-IN"/>
+          <w14:ligatures w14:val="none"/>
+        </w:rPr>
+        <w:t xml:space="preserve">    git fetch origin</w:t>
+      </w:r>
+    </w:p>
+    <w:p>
+      <w:pPr>
+        <w:shd w:val="clear" w:color="auto" w:fill="FFFFFF"/>
+        <w:spacing w:after="0" w:line="285" w:lineRule="atLeast"/>
+        <w:rPr>
+          <w:rFonts w:ascii="Consolas" w:eastAsia="Times New Roman" w:hAnsi="Consolas" w:cs="Times New Roman"/>
+          <w:color w:val="3B3B3B"/>
+          <w:kern w:val="0"/>
+          <w:sz w:val="21"/>
+          <w:szCs w:val="21"/>
+          <w:lang w:eastAsia="en-IN"/>
+          <w14:ligatures w14:val="none"/>
+        </w:rPr>
+      </w:pPr>
+      <w:r>
+        <w:rPr>
+          <w:rFonts w:ascii="Consolas" w:eastAsia="Times New Roman" w:hAnsi="Consolas" w:cs="Times New Roman"/>
+          <w:color w:val="3B3B3B"/>
+          <w:kern w:val="0"/>
+          <w:sz w:val="21"/>
+          <w:szCs w:val="21"/>
+          <w:lang w:eastAsia="en-IN"/>
+          <w14:ligatures w14:val="none"/>
+        </w:rPr>
+        <w:t xml:space="preserve">    git checkout -B azure-devops origin/azure-devops</w:t>
+      </w:r>
+    </w:p>
+    <w:p>
+      <w:pPr>
+        <w:shd w:val="clear" w:color="auto" w:fill="FFFFFF"/>
+        <w:spacing w:after="0" w:line="285" w:lineRule="atLeast"/>
+        <w:rPr>
+          <w:rFonts w:ascii="Consolas" w:eastAsia="Times New Roman" w:hAnsi="Consolas" w:cs="Times New Roman"/>
+          <w:color w:val="3B3B3B"/>
+          <w:kern w:val="0"/>
+          <w:sz w:val="21"/>
+          <w:szCs w:val="21"/>
+          <w:lang w:eastAsia="en-IN"/>
+          <w14:ligatures w14:val="none"/>
+        </w:rPr>
+      </w:pPr>
+    </w:p>
+    <w:p>
+      <w:pPr>
+        <w:shd w:val="clear" w:color="auto" w:fill="FFFFFF"/>
+        <w:spacing w:after="0" w:line="285" w:lineRule="atLeast"/>
+        <w:rPr>
+          <w:rFonts w:ascii="Consolas" w:eastAsia="Times New Roman" w:hAnsi="Consolas" w:cs="Times New Roman"/>
+          <w:color w:val="3B3B3B"/>
+          <w:kern w:val="0"/>
+          <w:sz w:val="21"/>
+          <w:szCs w:val="21"/>
+          <w:lang w:eastAsia="en-IN"/>
+          <w14:ligatures w14:val="none"/>
+        </w:rPr>
+      </w:pPr>
+      <w:r>
+        <w:rPr>
+          <w:rFonts w:ascii="Consolas" w:eastAsia="Times New Roman" w:hAnsi="Consolas" w:cs="Times New Roman"/>
+          <w:color w:val="3B3B3B"/>
+          <w:kern w:val="0"/>
+          <w:sz w:val="21"/>
+          <w:szCs w:val="21"/>
+          <w:lang w:eastAsia="en-IN"/>
+          <w14:ligatures w14:val="none"/>
+        </w:rPr>
+        <w:t xml:space="preserve">    git add charts/fitness-app/values.yaml</w:t>
+      </w:r>
+    </w:p>
+    <w:p>
+      <w:pPr>
+        <w:shd w:val="clear" w:color="auto" w:fill="FFFFFF"/>
+        <w:spacing w:after="0" w:line="285" w:lineRule="atLeast"/>
+        <w:rPr>
+          <w:rFonts w:ascii="Consolas" w:eastAsia="Times New Roman" w:hAnsi="Consolas" w:cs="Times New Roman"/>
+          <w:color w:val="3B3B3B"/>
+          <w:kern w:val="0"/>
+          <w:sz w:val="21"/>
+          <w:szCs w:val="21"/>
+          <w:lang w:eastAsia="en-IN"/>
+          <w14:ligatures w14:val="none"/>
+        </w:rPr>
+      </w:pPr>
+      <w:r>
+        <w:rPr>
+          <w:rFonts w:ascii="Consolas" w:eastAsia="Times New Roman" w:hAnsi="Consolas" w:cs="Times New Roman"/>
+          <w:color w:val="3B3B3B"/>
+          <w:kern w:val="0"/>
+          <w:sz w:val="21"/>
+          <w:szCs w:val="21"/>
+          <w:lang w:eastAsia="en-IN"/>
+          <w14:ligatures w14:val="none"/>
+        </w:rPr>
+        <w:t xml:space="preserve">    git commit -m "Update image tag to $(tag)"</w:t>
+      </w:r>
+    </w:p>
+    <w:p>
+      <w:pPr>
+        <w:shd w:val="clear" w:color="auto" w:fill="FFFFFF"/>
+        <w:spacing w:after="0" w:line="285" w:lineRule="atLeast"/>
+        <w:rPr>
+          <w:rFonts w:ascii="Consolas" w:eastAsia="Times New Roman" w:hAnsi="Consolas" w:cs="Times New Roman"/>
+          <w:color w:val="3B3B3B"/>
+          <w:kern w:val="0"/>
+          <w:sz w:val="21"/>
+          <w:szCs w:val="21"/>
+          <w:lang w:eastAsia="en-IN"/>
+          <w14:ligatures w14:val="none"/>
+        </w:rPr>
+      </w:pPr>
+    </w:p>
+    <w:p>
+      <w:pPr>
+        <w:shd w:val="clear" w:color="auto" w:fill="FFFFFF"/>
+        <w:spacing w:after="0" w:line="285" w:lineRule="atLeast"/>
+        <w:rPr>
+          <w:rFonts w:ascii="Consolas" w:eastAsia="Times New Roman" w:hAnsi="Consolas" w:cs="Times New Roman"/>
+          <w:color w:val="3B3B3B"/>
+          <w:kern w:val="0"/>
+          <w:sz w:val="21"/>
+          <w:szCs w:val="21"/>
+          <w:lang w:eastAsia="en-IN"/>
+          <w14:ligatures w14:val="none"/>
+        </w:rPr>
+      </w:pPr>
+      <w:r>
+        <w:rPr>
+          <w:rFonts w:ascii="Consolas" w:eastAsia="Times New Roman" w:hAnsi="Consolas" w:cs="Times New Roman"/>
+          <w:color w:val="3B3B3B"/>
+          <w:kern w:val="0"/>
+          <w:sz w:val="21"/>
+          <w:szCs w:val="21"/>
+          <w:lang w:eastAsia="en-IN"/>
+          <w14:ligatures w14:val="none"/>
+        </w:rPr>
+        <w:t xml:space="preserve">    git push https://$GITHUB_PAT@github.com/Msocial123/Fitness-Tracker-Dynamic-Volumes.git azure-devops</w:t>
+      </w:r>
+    </w:p>
+    <w:p>
+      <w:pPr>
+        <w:shd w:val="clear" w:color="auto" w:fill="FFFFFF"/>
+        <w:spacing w:after="0" w:line="285" w:lineRule="atLeast"/>
+        <w:rPr>
+          <w:rFonts w:ascii="Consolas" w:eastAsia="Times New Roman" w:hAnsi="Consolas" w:cs="Times New Roman"/>
+          <w:color w:val="3B3B3B"/>
+          <w:kern w:val="0"/>
+          <w:sz w:val="21"/>
+          <w:szCs w:val="21"/>
+          <w:lang w:eastAsia="en-IN"/>
+          <w14:ligatures w14:val="none"/>
+        </w:rPr>
+      </w:pPr>
+      <w:r>
+        <w:rPr>
+          <w:rFonts w:ascii="Consolas" w:eastAsia="Times New Roman" w:hAnsi="Consolas" w:cs="Times New Roman"/>
+          <w:color w:val="3B3B3B"/>
+          <w:kern w:val="0"/>
+          <w:sz w:val="21"/>
+          <w:szCs w:val="21"/>
+          <w:lang w:eastAsia="en-IN"/>
+          <w14:ligatures w14:val="none"/>
+        </w:rPr>
+        <w:t xml:space="preserve">  displayName: Update Helm values</w:t>
+      </w:r>
+    </w:p>
+    <w:p>
+      <w:pPr>
+        <w:shd w:val="clear" w:color="auto" w:fill="FFFFFF"/>
+        <w:spacing w:after="0" w:line="285" w:lineRule="atLeast"/>
+        <w:rPr>
+          <w:rFonts w:ascii="Consolas" w:eastAsia="Times New Roman" w:hAnsi="Consolas" w:cs="Times New Roman"/>
+          <w:color w:val="3B3B3B"/>
+          <w:kern w:val="0"/>
+          <w:sz w:val="21"/>
+          <w:szCs w:val="21"/>
+          <w:lang w:eastAsia="en-IN"/>
+          <w14:ligatures w14:val="none"/>
+        </w:rPr>
+      </w:pPr>
+      <w:r>
+        <w:rPr>
+          <w:rFonts w:ascii="Consolas" w:eastAsia="Times New Roman" w:hAnsi="Consolas" w:cs="Times New Roman"/>
+          <w:color w:val="3B3B3B"/>
+          <w:kern w:val="0"/>
+          <w:sz w:val="21"/>
+          <w:szCs w:val="21"/>
+          <w:lang w:eastAsia="en-IN"/>
+          <w14:ligatures w14:val="none"/>
+        </w:rPr>
+        <w:t xml:space="preserve">  env:</w:t>
+      </w:r>
+    </w:p>
+    <w:p>
+      <w:pPr>
+        <w:shd w:val="clear" w:color="auto" w:fill="FFFFFF"/>
+        <w:spacing w:after="0" w:line="285" w:lineRule="atLeast"/>
+        <w:rPr>
+          <w:rFonts w:ascii="Consolas" w:eastAsia="Times New Roman" w:hAnsi="Consolas" w:cs="Times New Roman"/>
+          <w:color w:val="3B3B3B"/>
+          <w:kern w:val="0"/>
+          <w:sz w:val="21"/>
+          <w:szCs w:val="21"/>
+          <w:lang w:eastAsia="en-IN"/>
+          <w14:ligatures w14:val="none"/>
+        </w:rPr>
+      </w:pPr>
+      <w:r>
+        <w:rPr>
+          <w:rFonts w:ascii="Consolas" w:eastAsia="Times New Roman" w:hAnsi="Consolas" w:cs="Times New Roman"/>
+          <w:color w:val="3B3B3B"/>
+          <w:kern w:val="0"/>
+          <w:sz w:val="21"/>
+          <w:szCs w:val="21"/>
+          <w:lang w:eastAsia="en-IN"/>
+          <w14:ligatures w14:val="none"/>
+        </w:rPr>
+        <w:t xml:space="preserve">    GITHUB_PAT: $(GITHUB_PAT)</w:t>
+      </w:r>
     </w:p>
     <w:p>
       <w:pPr>
@@ -2970,6 +2100,7 @@
           <w:lang w:eastAsia="en-IN"/>
           <w14:ligatures w14:val="none"/>
         </w:rPr>
+        <w:lastRenderedPageBreak/>
         <w:t>Create Required Service Connections (VERY IMPORTANT)</w:t>
       </w:r>
     </w:p>
@@ -3075,7 +2206,6 @@
           <w:lang w:eastAsia="en-IN"/>
           <w14:ligatures w14:val="none"/>
         </w:rPr>
-        <w:lastRenderedPageBreak/>
         <w:t>Azure authentication</w:t>
       </w:r>
     </w:p>
@@ -3369,7 +2499,6 @@
           <w:lang w:eastAsia="en-IN"/>
           <w14:ligatures w14:val="none"/>
         </w:rPr>
-        <w:lastRenderedPageBreak/>
         <w:drawing>
           <wp:inline distT="0" distB="0" distL="0" distR="0" wp14:anchorId="1AAD77CE" wp14:editId="3A433AA9">
             <wp:extent cx="5731510" cy="2553970"/>
@@ -4345,7 +3474,6 @@
           <w14:ligatures w14:val="none"/>
         </w:rPr>
       </w:pPr>
-      <w:proofErr w:type="spellStart"/>
       <w:r>
         <w:rPr>
           <w:rFonts w:ascii="Courier New" w:eastAsia="Times New Roman" w:hAnsi="Courier New" w:cs="Courier New"/>
@@ -4355,19 +3483,7 @@
           <w:lang w:eastAsia="en-IN"/>
           <w14:ligatures w14:val="none"/>
         </w:rPr>
-        <w:t>containerRegistry</w:t>
-      </w:r>
-      <w:proofErr w:type="spellEnd"/>
-      <w:r>
-        <w:rPr>
-          <w:rFonts w:ascii="Courier New" w:eastAsia="Times New Roman" w:hAnsi="Courier New" w:cs="Courier New"/>
-          <w:kern w:val="0"/>
-          <w:sz w:val="20"/>
-          <w:szCs w:val="20"/>
-          <w:lang w:eastAsia="en-IN"/>
-          <w14:ligatures w14:val="none"/>
-        </w:rPr>
-        <w:t>: ACR-Service-Connection</w:t>
+        <w:t>containerRegistry: ACR-Service-Connection</w:t>
       </w:r>
     </w:p>
     <w:p>
@@ -4475,6 +3591,7 @@
       <w:r>
         <w:rPr>
           <w:rFonts w:ascii="Times New Roman" w:eastAsia="Times New Roman" w:hAnsi="Times New Roman" w:cs="Times New Roman"/>
+          <w:noProof/>
           <w:kern w:val="0"/>
           <w:sz w:val="28"/>
           <w:szCs w:val="28"/>
@@ -4546,6 +3663,7 @@
       <w:r>
         <w:rPr>
           <w:rFonts w:ascii="Times New Roman" w:eastAsia="Times New Roman" w:hAnsi="Times New Roman" w:cs="Times New Roman"/>
+          <w:noProof/>
           <w:kern w:val="0"/>
           <w:sz w:val="28"/>
           <w:szCs w:val="28"/>
@@ -4618,6 +3736,7 @@
       <w:r>
         <w:rPr>
           <w:rFonts w:ascii="Times New Roman" w:eastAsia="Times New Roman" w:hAnsi="Times New Roman" w:cs="Times New Roman"/>
+          <w:noProof/>
           <w:kern w:val="0"/>
           <w:sz w:val="28"/>
           <w:szCs w:val="28"/>

</xml_diff>